<commit_message>
Update Report + Q Netowork Optimised + Logged Runs
</commit_message>
<xml_diff>
--- a/A_Beukes_Skripsie_Progress_Report.docx
+++ b/A_Beukes_Skripsie_Progress_Report.docx
@@ -23,62 +23,7 @@
           <w:sz w:val="56"/>
           <w:szCs w:val="56"/>
         </w:rPr>
-        <w:t xml:space="preserve">The </w:t>
-      </w:r>
-      <w:r>
-        <w:rPr>
-          <w:rFonts w:asciiTheme="majorHAnsi" w:hAnsiTheme="majorHAnsi" w:cs="Arial"/>
-          <w:b/>
-          <w:bCs/>
-          <w:kern w:val="28"/>
-          <w:sz w:val="56"/>
-          <w:szCs w:val="56"/>
-        </w:rPr>
-        <w:t>Compressi</w:t>
-      </w:r>
-      <w:r>
-        <w:rPr>
-          <w:rFonts w:asciiTheme="majorHAnsi" w:hAnsiTheme="majorHAnsi" w:cs="Arial"/>
-          <w:b/>
-          <w:bCs/>
-          <w:kern w:val="28"/>
-          <w:sz w:val="56"/>
-          <w:szCs w:val="56"/>
-        </w:rPr>
-        <w:t xml:space="preserve">on of </w:t>
-      </w:r>
-      <w:r>
-        <w:rPr>
-          <w:rFonts w:asciiTheme="majorHAnsi" w:hAnsiTheme="majorHAnsi" w:cs="Arial"/>
-          <w:b/>
-          <w:bCs/>
-          <w:kern w:val="28"/>
-          <w:sz w:val="56"/>
-          <w:szCs w:val="56"/>
-        </w:rPr>
-        <w:t>Deep Reinforcement Learning Agent</w:t>
-      </w:r>
-      <w:r>
-        <w:rPr>
-          <w:rFonts w:asciiTheme="majorHAnsi" w:hAnsiTheme="majorHAnsi" w:cs="Arial"/>
-          <w:b/>
-          <w:bCs/>
-          <w:kern w:val="28"/>
-          <w:sz w:val="56"/>
-          <w:szCs w:val="56"/>
-        </w:rPr>
-        <w:t>s</w:t>
-      </w:r>
-      <w:r>
-        <w:rPr>
-          <w:rFonts w:asciiTheme="majorHAnsi" w:hAnsiTheme="majorHAnsi" w:cs="Arial"/>
-          <w:b/>
-          <w:bCs/>
-          <w:kern w:val="28"/>
-          <w:sz w:val="56"/>
-          <w:szCs w:val="56"/>
-        </w:rPr>
-        <w:t xml:space="preserve"> onto</w:t>
+        <w:t>The Compression of Deep Reinforcement Learning Agents onto</w:t>
       </w:r>
     </w:p>
     <w:p>
@@ -2031,6 +1976,7 @@
           <w:kern w:val="28"/>
           <w:sz w:val="40"/>
         </w:rPr>
+        <w:lastRenderedPageBreak/>
         <w:t>Executive Summary</w:t>
       </w:r>
     </w:p>
@@ -2048,12 +1994,12 @@
     <w:tbl>
       <w:tblPr>
         <w:tblStyle w:val="PlainTable1"/>
-        <w:tblW w:w="10031" w:type="dxa"/>
+        <w:tblW w:w="9209" w:type="dxa"/>
         <w:tblLayout w:type="fixed"/>
         <w:tblLook w:val="04A0" w:firstRow="1" w:lastRow="0" w:firstColumn="1" w:lastColumn="0" w:noHBand="0" w:noVBand="1"/>
       </w:tblPr>
       <w:tblGrid>
-        <w:gridCol w:w="10031"/>
+        <w:gridCol w:w="9209"/>
       </w:tblGrid>
       <w:tr>
         <w:trPr>
@@ -2062,7 +2008,7 @@
         <w:tc>
           <w:tcPr>
             <w:cnfStyle w:val="001000000000" w:firstRow="0" w:lastRow="0" w:firstColumn="1" w:lastColumn="0" w:oddVBand="0" w:evenVBand="0" w:oddHBand="0" w:evenHBand="0" w:firstRowFirstColumn="0" w:firstRowLastColumn="0" w:lastRowFirstColumn="0" w:lastRowLastColumn="0"/>
-            <w:tcW w:w="10031" w:type="dxa"/>
+            <w:tcW w:w="9209" w:type="dxa"/>
             <w:shd w:val="clear" w:color="auto" w:fill="D9D9D9" w:themeFill="background1" w:themeFillShade="D9"/>
             <w:hideMark/>
           </w:tcPr>
@@ -2094,7 +2040,7 @@
         <w:tc>
           <w:tcPr>
             <w:cnfStyle w:val="001000000000" w:firstRow="0" w:lastRow="0" w:firstColumn="1" w:lastColumn="0" w:oddVBand="0" w:evenVBand="0" w:oddHBand="0" w:evenHBand="0" w:firstRowFirstColumn="0" w:firstRowLastColumn="0" w:lastRowFirstColumn="0" w:lastRowLastColumn="0"/>
-            <w:tcW w:w="10031" w:type="dxa"/>
+            <w:tcW w:w="9209" w:type="dxa"/>
             <w:shd w:val="clear" w:color="auto" w:fill="FFFFFF" w:themeFill="background1"/>
           </w:tcPr>
           <w:p>
@@ -2116,27 +2062,7 @@
                 <w:sz w:val="24"/>
                 <w:lang w:val="en-ZA"/>
               </w:rPr>
-              <w:t>The Compression of Deep Reinforcement Learning Agents onto</w:t>
-            </w:r>
-            <w:r>
-              <w:rPr>
-                <w:rFonts w:ascii="Arial" w:hAnsi="Arial"/>
-                <w:b w:val="0"/>
-                <w:bCs w:val="0"/>
-                <w:sz w:val="24"/>
-                <w:lang w:val="en-ZA"/>
-              </w:rPr>
-              <w:t xml:space="preserve"> </w:t>
-            </w:r>
-            <w:r>
-              <w:rPr>
-                <w:rFonts w:ascii="Arial" w:hAnsi="Arial"/>
-                <w:b w:val="0"/>
-                <w:bCs w:val="0"/>
-                <w:sz w:val="24"/>
-                <w:lang w:val="en-ZA"/>
-              </w:rPr>
-              <w:t>Embedded Microcontrollers</w:t>
+              <w:t>The Compression of Deep Reinforcement Learning Agents onto Embedded Microcontrollers</w:t>
             </w:r>
           </w:p>
         </w:tc>
@@ -2145,7 +2071,7 @@
         <w:tc>
           <w:tcPr>
             <w:cnfStyle w:val="001000000000" w:firstRow="0" w:lastRow="0" w:firstColumn="1" w:lastColumn="0" w:oddVBand="0" w:evenVBand="0" w:oddHBand="0" w:evenHBand="0" w:firstRowFirstColumn="0" w:firstRowLastColumn="0" w:lastRowFirstColumn="0" w:lastRowLastColumn="0"/>
-            <w:tcW w:w="10031" w:type="dxa"/>
+            <w:tcW w:w="9209" w:type="dxa"/>
             <w:shd w:val="clear" w:color="auto" w:fill="D9D9D9" w:themeFill="background1" w:themeFillShade="D9"/>
             <w:hideMark/>
           </w:tcPr>
@@ -2177,7 +2103,7 @@
         <w:tc>
           <w:tcPr>
             <w:cnfStyle w:val="001000000000" w:firstRow="0" w:lastRow="0" w:firstColumn="1" w:lastColumn="0" w:oddVBand="0" w:evenVBand="0" w:oddHBand="0" w:evenHBand="0" w:firstRowFirstColumn="0" w:firstRowLastColumn="0" w:lastRowFirstColumn="0" w:lastRowLastColumn="0"/>
-            <w:tcW w:w="10031" w:type="dxa"/>
+            <w:tcW w:w="9209" w:type="dxa"/>
             <w:shd w:val="clear" w:color="auto" w:fill="FFFFFF" w:themeFill="background1"/>
           </w:tcPr>
           <w:p>
@@ -2208,7 +2134,7 @@
         <w:tc>
           <w:tcPr>
             <w:cnfStyle w:val="001000000000" w:firstRow="0" w:lastRow="0" w:firstColumn="1" w:lastColumn="0" w:oddVBand="0" w:evenVBand="0" w:oddHBand="0" w:evenHBand="0" w:firstRowFirstColumn="0" w:firstRowLastColumn="0" w:lastRowFirstColumn="0" w:lastRowLastColumn="0"/>
-            <w:tcW w:w="10031" w:type="dxa"/>
+            <w:tcW w:w="9209" w:type="dxa"/>
             <w:shd w:val="clear" w:color="auto" w:fill="D9D9D9" w:themeFill="background1" w:themeFillShade="D9"/>
             <w:hideMark/>
           </w:tcPr>
@@ -2240,7 +2166,7 @@
         <w:tc>
           <w:tcPr>
             <w:cnfStyle w:val="001000000000" w:firstRow="0" w:lastRow="0" w:firstColumn="1" w:lastColumn="0" w:oddVBand="0" w:evenVBand="0" w:oddHBand="0" w:evenHBand="0" w:firstRowFirstColumn="0" w:firstRowLastColumn="0" w:lastRowFirstColumn="0" w:lastRowLastColumn="0"/>
-            <w:tcW w:w="10031" w:type="dxa"/>
+            <w:tcW w:w="9209" w:type="dxa"/>
             <w:shd w:val="clear" w:color="auto" w:fill="FFFFFF" w:themeFill="background1"/>
           </w:tcPr>
           <w:p>
@@ -2259,7 +2185,7 @@
         <w:tc>
           <w:tcPr>
             <w:cnfStyle w:val="001000000000" w:firstRow="0" w:lastRow="0" w:firstColumn="1" w:lastColumn="0" w:oddVBand="0" w:evenVBand="0" w:oddHBand="0" w:evenHBand="0" w:firstRowFirstColumn="0" w:firstRowLastColumn="0" w:lastRowFirstColumn="0" w:lastRowLastColumn="0"/>
-            <w:tcW w:w="10031" w:type="dxa"/>
+            <w:tcW w:w="9209" w:type="dxa"/>
             <w:shd w:val="clear" w:color="auto" w:fill="D9D9D9" w:themeFill="background1" w:themeFillShade="D9"/>
             <w:hideMark/>
           </w:tcPr>
@@ -2291,7 +2217,7 @@
         <w:tc>
           <w:tcPr>
             <w:cnfStyle w:val="001000000000" w:firstRow="0" w:lastRow="0" w:firstColumn="1" w:lastColumn="0" w:oddVBand="0" w:evenVBand="0" w:oddHBand="0" w:evenHBand="0" w:firstRowFirstColumn="0" w:firstRowLastColumn="0" w:lastRowFirstColumn="0" w:lastRowLastColumn="0"/>
-            <w:tcW w:w="10031" w:type="dxa"/>
+            <w:tcW w:w="9209" w:type="dxa"/>
             <w:shd w:val="clear" w:color="auto" w:fill="FFFFFF" w:themeFill="background1"/>
           </w:tcPr>
           <w:p>
@@ -2310,7 +2236,7 @@
         <w:tc>
           <w:tcPr>
             <w:cnfStyle w:val="001000000000" w:firstRow="0" w:lastRow="0" w:firstColumn="1" w:lastColumn="0" w:oddVBand="0" w:evenVBand="0" w:oddHBand="0" w:evenHBand="0" w:firstRowFirstColumn="0" w:firstRowLastColumn="0" w:lastRowFirstColumn="0" w:lastRowLastColumn="0"/>
-            <w:tcW w:w="10031" w:type="dxa"/>
+            <w:tcW w:w="9209" w:type="dxa"/>
             <w:shd w:val="clear" w:color="auto" w:fill="D9D9D9" w:themeFill="background1" w:themeFillShade="D9"/>
             <w:hideMark/>
           </w:tcPr>
@@ -2342,7 +2268,7 @@
         <w:tc>
           <w:tcPr>
             <w:cnfStyle w:val="001000000000" w:firstRow="0" w:lastRow="0" w:firstColumn="1" w:lastColumn="0" w:oddVBand="0" w:evenVBand="0" w:oddHBand="0" w:evenHBand="0" w:firstRowFirstColumn="0" w:firstRowLastColumn="0" w:lastRowFirstColumn="0" w:lastRowLastColumn="0"/>
-            <w:tcW w:w="10031" w:type="dxa"/>
+            <w:tcW w:w="9209" w:type="dxa"/>
             <w:shd w:val="clear" w:color="auto" w:fill="FFFFFF" w:themeFill="background1"/>
           </w:tcPr>
           <w:p>
@@ -2361,7 +2287,7 @@
         <w:tc>
           <w:tcPr>
             <w:cnfStyle w:val="001000000000" w:firstRow="0" w:lastRow="0" w:firstColumn="1" w:lastColumn="0" w:oddVBand="0" w:evenVBand="0" w:oddHBand="0" w:evenHBand="0" w:firstRowFirstColumn="0" w:firstRowLastColumn="0" w:lastRowFirstColumn="0" w:lastRowLastColumn="0"/>
-            <w:tcW w:w="10031" w:type="dxa"/>
+            <w:tcW w:w="9209" w:type="dxa"/>
             <w:shd w:val="clear" w:color="auto" w:fill="D9D9D9" w:themeFill="background1" w:themeFillShade="D9"/>
             <w:hideMark/>
           </w:tcPr>
@@ -2393,7 +2319,7 @@
         <w:tc>
           <w:tcPr>
             <w:cnfStyle w:val="001000000000" w:firstRow="0" w:lastRow="0" w:firstColumn="1" w:lastColumn="0" w:oddVBand="0" w:evenVBand="0" w:oddHBand="0" w:evenHBand="0" w:firstRowFirstColumn="0" w:firstRowLastColumn="0" w:lastRowFirstColumn="0" w:lastRowLastColumn="0"/>
-            <w:tcW w:w="10031" w:type="dxa"/>
+            <w:tcW w:w="9209" w:type="dxa"/>
             <w:shd w:val="clear" w:color="auto" w:fill="FFFFFF" w:themeFill="background1"/>
           </w:tcPr>
           <w:p>
@@ -2422,7 +2348,7 @@
         <w:tc>
           <w:tcPr>
             <w:cnfStyle w:val="001000000000" w:firstRow="0" w:lastRow="0" w:firstColumn="1" w:lastColumn="0" w:oddVBand="0" w:evenVBand="0" w:oddHBand="0" w:evenHBand="0" w:firstRowFirstColumn="0" w:firstRowLastColumn="0" w:lastRowFirstColumn="0" w:lastRowLastColumn="0"/>
-            <w:tcW w:w="10031" w:type="dxa"/>
+            <w:tcW w:w="9209" w:type="dxa"/>
             <w:shd w:val="clear" w:color="auto" w:fill="D9D9D9" w:themeFill="background1" w:themeFillShade="D9"/>
             <w:hideMark/>
           </w:tcPr>
@@ -2470,7 +2396,7 @@
         <w:tc>
           <w:tcPr>
             <w:cnfStyle w:val="001000000000" w:firstRow="0" w:lastRow="0" w:firstColumn="1" w:lastColumn="0" w:oddVBand="0" w:evenVBand="0" w:oddHBand="0" w:evenHBand="0" w:firstRowFirstColumn="0" w:firstRowLastColumn="0" w:lastRowFirstColumn="0" w:lastRowLastColumn="0"/>
-            <w:tcW w:w="10031" w:type="dxa"/>
+            <w:tcW w:w="9209" w:type="dxa"/>
             <w:shd w:val="clear" w:color="auto" w:fill="FFFFFF" w:themeFill="background1"/>
           </w:tcPr>
           <w:p>
@@ -2489,7 +2415,7 @@
         <w:tc>
           <w:tcPr>
             <w:cnfStyle w:val="001000000000" w:firstRow="0" w:lastRow="0" w:firstColumn="1" w:lastColumn="0" w:oddVBand="0" w:evenVBand="0" w:oddHBand="0" w:evenHBand="0" w:firstRowFirstColumn="0" w:firstRowLastColumn="0" w:lastRowFirstColumn="0" w:lastRowLastColumn="0"/>
-            <w:tcW w:w="10031" w:type="dxa"/>
+            <w:tcW w:w="9209" w:type="dxa"/>
             <w:shd w:val="clear" w:color="auto" w:fill="D9D9D9" w:themeFill="background1" w:themeFillShade="D9"/>
             <w:hideMark/>
           </w:tcPr>
@@ -2521,7 +2447,7 @@
         <w:tc>
           <w:tcPr>
             <w:cnfStyle w:val="001000000000" w:firstRow="0" w:lastRow="0" w:firstColumn="1" w:lastColumn="0" w:oddVBand="0" w:evenVBand="0" w:oddHBand="0" w:evenHBand="0" w:firstRowFirstColumn="0" w:firstRowLastColumn="0" w:lastRowFirstColumn="0" w:lastRowLastColumn="0"/>
-            <w:tcW w:w="10031" w:type="dxa"/>
+            <w:tcW w:w="9209" w:type="dxa"/>
             <w:shd w:val="clear" w:color="auto" w:fill="FFFFFF" w:themeFill="background1"/>
           </w:tcPr>
           <w:p>
@@ -2540,7 +2466,7 @@
         <w:tc>
           <w:tcPr>
             <w:cnfStyle w:val="001000000000" w:firstRow="0" w:lastRow="0" w:firstColumn="1" w:lastColumn="0" w:oddVBand="0" w:evenVBand="0" w:oddHBand="0" w:evenHBand="0" w:firstRowFirstColumn="0" w:firstRowLastColumn="0" w:lastRowFirstColumn="0" w:lastRowLastColumn="0"/>
-            <w:tcW w:w="10031" w:type="dxa"/>
+            <w:tcW w:w="9209" w:type="dxa"/>
             <w:shd w:val="clear" w:color="auto" w:fill="D9D9D9" w:themeFill="background1" w:themeFillShade="D9"/>
             <w:hideMark/>
           </w:tcPr>
@@ -2572,7 +2498,7 @@
         <w:tc>
           <w:tcPr>
             <w:cnfStyle w:val="001000000000" w:firstRow="0" w:lastRow="0" w:firstColumn="1" w:lastColumn="0" w:oddVBand="0" w:evenVBand="0" w:oddHBand="0" w:evenHBand="0" w:firstRowFirstColumn="0" w:firstRowLastColumn="0" w:lastRowFirstColumn="0" w:lastRowLastColumn="0"/>
-            <w:tcW w:w="10031" w:type="dxa"/>
+            <w:tcW w:w="9209" w:type="dxa"/>
             <w:shd w:val="clear" w:color="auto" w:fill="FFFFFF" w:themeFill="background1"/>
           </w:tcPr>
           <w:p>
@@ -5745,13 +5671,7 @@
         <w:t xml:space="preserve"> </w:t>
       </w:r>
       <w:r>
-        <w:t xml:space="preserve">patterns in data, enabling a system </w:t>
-      </w:r>
-      <w:r>
-        <w:t>to” learn</w:t>
-      </w:r>
-      <w:r>
-        <w:t>” and make predictions or decisions that improve</w:t>
+        <w:t>patterns in data, enabling a system to” learn” and make predictions or decisions that improve</w:t>
       </w:r>
       <w:r>
         <w:t xml:space="preserve"> </w:t>
@@ -5821,13 +5741,7 @@
         <w:t xml:space="preserve"> </w:t>
       </w:r>
       <w:r>
-        <w:t xml:space="preserve">was proposed by Prof HA Engelbrecht, and will be done by Miss AL Beukes as </w:t>
-      </w:r>
-      <w:r>
-        <w:t>a part</w:t>
-      </w:r>
-      <w:r>
-        <w:t xml:space="preserve"> of the</w:t>
+        <w:t>was proposed by Prof HA Engelbrecht, and will be done by Miss AL Beukes as a part of the</w:t>
       </w:r>
       <w:r>
         <w:t xml:space="preserve"> </w:t>
@@ -5853,13 +5767,7 @@
         <w:pStyle w:val="Text1"/>
       </w:pPr>
       <w:r>
-        <w:t xml:space="preserve">The aim of this project is to compress a trained Deep Reinforcement Learning algorithm </w:t>
-      </w:r>
-      <w:r>
-        <w:t>and deploy</w:t>
-      </w:r>
-      <w:r>
-        <w:t xml:space="preserve"> the agent onto an embedded device, without trading off the execution speed and performance. The objectives are as follows:</w:t>
+        <w:t>The aim of this project is to compress a trained Deep Reinforcement Learning algorithm and deploy the agent onto an embedded device, without trading off the execution speed and performance. The objectives are as follows:</w:t>
       </w:r>
     </w:p>
     <w:p>
@@ -6081,24 +5989,33 @@
       <w:pPr>
         <w:pStyle w:val="Heading1"/>
       </w:pPr>
-      <w:bookmarkStart w:id="34" w:name="_Toc403653353"/>
-      <w:bookmarkStart w:id="35" w:name="_Toc235529085"/>
+      <w:bookmarkStart w:id="34" w:name="_Toc235529085"/>
+      <w:bookmarkStart w:id="35" w:name="_Toc403653353"/>
       <w:r>
         <w:lastRenderedPageBreak/>
         <w:t>Progress Completed</w:t>
       </w:r>
-      <w:bookmarkEnd w:id="35"/>
+      <w:bookmarkEnd w:id="34"/>
+    </w:p>
+    <w:p>
+      <w:pPr>
+        <w:pStyle w:val="Text1"/>
+      </w:pPr>
+      <w:r>
+        <w:t xml:space="preserve">This section discusses the project’s current progress until the date of submission of this report. </w:t>
+      </w:r>
     </w:p>
     <w:p>
       <w:pPr>
         <w:pStyle w:val="Heading2"/>
+        <w:spacing w:after="240"/>
       </w:pPr>
       <w:bookmarkStart w:id="36" w:name="_Toc235529086"/>
       <w:r>
         <w:t>D</w:t>
       </w:r>
       <w:r>
-        <w:t>QN</w:t>
+        <w:t>RL</w:t>
       </w:r>
       <w:r>
         <w:t xml:space="preserve"> Agent Development</w:t>
@@ -6107,7 +6024,94 @@
     </w:p>
     <w:p>
       <w:pPr>
+        <w:jc w:val="both"/>
+        <w:rPr>
+          <w:sz w:val="24"/>
+          <w:szCs w:val="24"/>
+        </w:rPr>
+      </w:pPr>
+      <w:r>
+        <w:rPr>
+          <w:sz w:val="24"/>
+          <w:szCs w:val="24"/>
+        </w:rPr>
+        <w:t xml:space="preserve">A deep reinforcement learning agent </w:t>
+      </w:r>
+      <w:r>
+        <w:rPr>
+          <w:sz w:val="24"/>
+          <w:szCs w:val="24"/>
+        </w:rPr>
+        <w:t>was</w:t>
+      </w:r>
+      <w:r>
+        <w:rPr>
+          <w:sz w:val="24"/>
+          <w:szCs w:val="24"/>
+        </w:rPr>
+        <w:t xml:space="preserve"> implemented and trained before compression of </w:t>
+      </w:r>
+      <w:r>
+        <w:rPr>
+          <w:sz w:val="24"/>
+          <w:szCs w:val="24"/>
+        </w:rPr>
+        <w:t>its</w:t>
+      </w:r>
+      <w:r>
+        <w:rPr>
+          <w:sz w:val="24"/>
+          <w:szCs w:val="24"/>
+        </w:rPr>
+        <w:t xml:space="preserve"> policy network. This implementation </w:t>
+      </w:r>
+      <w:r>
+        <w:rPr>
+          <w:sz w:val="24"/>
+          <w:szCs w:val="24"/>
+        </w:rPr>
+        <w:t>wa</w:t>
+      </w:r>
+      <w:r>
+        <w:rPr>
+          <w:sz w:val="24"/>
+          <w:szCs w:val="24"/>
+        </w:rPr>
+        <w:t xml:space="preserve">s built from the ground up and the process </w:t>
+      </w:r>
+      <w:r>
+        <w:rPr>
+          <w:sz w:val="24"/>
+          <w:szCs w:val="24"/>
+        </w:rPr>
+        <w:t>was</w:t>
+      </w:r>
+      <w:r>
+        <w:rPr>
+          <w:sz w:val="24"/>
+          <w:szCs w:val="24"/>
+        </w:rPr>
+        <w:t xml:space="preserve"> divided into sections</w:t>
+      </w:r>
+      <w:r>
+        <w:rPr>
+          <w:sz w:val="24"/>
+          <w:szCs w:val="24"/>
+        </w:rPr>
+        <w:t>, which are outlined below</w:t>
+      </w:r>
+      <w:r>
+        <w:rPr>
+          <w:sz w:val="24"/>
+          <w:szCs w:val="24"/>
+        </w:rPr>
+        <w:t xml:space="preserve">. </w:t>
+      </w:r>
+    </w:p>
+    <w:p>
+      <w:pPr>
         <w:pStyle w:val="Heading3"/>
+        <w:spacing w:after="240"/>
       </w:pPr>
       <w:bookmarkStart w:id="37" w:name="_Toc235529087"/>
       <w:r>
@@ -6117,14 +6121,1219 @@
     </w:p>
     <w:p>
       <w:pPr>
-        <w:rPr>
-          <w:rFonts w:asciiTheme="majorHAnsi" w:hAnsiTheme="majorHAnsi" w:cs="Arial"/>
-          <w:b/>
-          <w:sz w:val="24"/>
-        </w:rPr>
-      </w:pPr>
-      <w:r>
-        <w:br w:type="page"/>
+        <w:jc w:val="both"/>
+        <w:rPr>
+          <w:sz w:val="24"/>
+          <w:szCs w:val="24"/>
+        </w:rPr>
+      </w:pPr>
+      <w:r>
+        <w:rPr>
+          <w:sz w:val="24"/>
+          <w:szCs w:val="24"/>
+        </w:rPr>
+        <w:t xml:space="preserve">The first step was the implementation of a Tabular Q-Learning Model. </w:t>
+      </w:r>
+      <w:r>
+        <w:rPr>
+          <w:sz w:val="24"/>
+          <w:szCs w:val="24"/>
+        </w:rPr>
+        <w:t xml:space="preserve">Because the aim of the project is to compress the policy network, a Q-Learning model was designed. Q-Learning has a </w:t>
+      </w:r>
+      <w:r>
+        <w:rPr>
+          <w:sz w:val="24"/>
+          <w:szCs w:val="24"/>
+        </w:rPr>
+        <w:t xml:space="preserve">value-based </w:t>
+      </w:r>
+      <w:r>
+        <w:rPr>
+          <w:sz w:val="24"/>
+          <w:szCs w:val="24"/>
+        </w:rPr>
+        <w:t xml:space="preserve">policy network, which is easier to compress in comparison to policy-based/actor-critic networks. </w:t>
+      </w:r>
+    </w:p>
+    <w:p>
+      <w:pPr>
+        <w:jc w:val="both"/>
+        <w:rPr>
+          <w:sz w:val="24"/>
+          <w:szCs w:val="24"/>
+        </w:rPr>
+      </w:pPr>
+      <w:r>
+        <w:rPr>
+          <w:noProof/>
+          <w:sz w:val="24"/>
+          <w:szCs w:val="24"/>
+        </w:rPr>
+        <w:drawing>
+          <wp:anchor distT="0" distB="0" distL="114300" distR="114300" simplePos="0" relativeHeight="251661824" behindDoc="1" locked="0" layoutInCell="1" allowOverlap="1" wp14:anchorId="5E82014D" wp14:editId="42DFB382">
+            <wp:simplePos x="0" y="0"/>
+            <wp:positionH relativeFrom="page">
+              <wp:posOffset>5753100</wp:posOffset>
+            </wp:positionH>
+            <wp:positionV relativeFrom="paragraph">
+              <wp:posOffset>94615</wp:posOffset>
+            </wp:positionV>
+            <wp:extent cx="1696085" cy="1716405"/>
+            <wp:effectExtent l="0" t="0" r="0" b="0"/>
+            <wp:wrapTight wrapText="bothSides">
+              <wp:wrapPolygon edited="0">
+                <wp:start x="0" y="0"/>
+                <wp:lineTo x="0" y="21336"/>
+                <wp:lineTo x="21349" y="21336"/>
+                <wp:lineTo x="21349" y="0"/>
+                <wp:lineTo x="0" y="0"/>
+              </wp:wrapPolygon>
+            </wp:wrapTight>
+            <wp:docPr id="1229694386" name="Picture 1"/>
+            <wp:cNvGraphicFramePr>
+              <a:graphicFrameLocks xmlns:a="http://schemas.openxmlformats.org/drawingml/2006/main" noChangeAspect="1"/>
+            </wp:cNvGraphicFramePr>
+            <a:graphic xmlns:a="http://schemas.openxmlformats.org/drawingml/2006/main">
+              <a:graphicData uri="http://schemas.openxmlformats.org/drawingml/2006/picture">
+                <pic:pic xmlns:pic="http://schemas.openxmlformats.org/drawingml/2006/picture">
+                  <pic:nvPicPr>
+                    <pic:cNvPr id="1229694386" name="Picture 1229694386"/>
+                    <pic:cNvPicPr/>
+                  </pic:nvPicPr>
+                  <pic:blipFill>
+                    <a:blip r:embed="rId17" cstate="print">
+                      <a:extLst>
+                        <a:ext uri="{28A0092B-C50C-407E-A947-70E740481C1C}">
+                          <a14:useLocalDpi xmlns:a14="http://schemas.microsoft.com/office/drawing/2010/main" val="0"/>
+                        </a:ext>
+                      </a:extLst>
+                    </a:blip>
+                    <a:stretch>
+                      <a:fillRect/>
+                    </a:stretch>
+                  </pic:blipFill>
+                  <pic:spPr>
+                    <a:xfrm>
+                      <a:off x="0" y="0"/>
+                      <a:ext cx="1696085" cy="1716405"/>
+                    </a:xfrm>
+                    <a:prstGeom prst="rect">
+                      <a:avLst/>
+                    </a:prstGeom>
+                  </pic:spPr>
+                </pic:pic>
+              </a:graphicData>
+            </a:graphic>
+            <wp14:sizeRelH relativeFrom="margin">
+              <wp14:pctWidth>0</wp14:pctWidth>
+            </wp14:sizeRelH>
+            <wp14:sizeRelV relativeFrom="margin">
+              <wp14:pctHeight>0</wp14:pctHeight>
+            </wp14:sizeRelV>
+          </wp:anchor>
+        </w:drawing>
+      </w:r>
+    </w:p>
+    <w:p>
+      <w:pPr>
+        <w:jc w:val="both"/>
+        <w:rPr>
+          <w:sz w:val="24"/>
+          <w:szCs w:val="24"/>
+        </w:rPr>
+      </w:pPr>
+      <w:r>
+        <w:rPr>
+          <w:sz w:val="24"/>
+          <w:szCs w:val="24"/>
+        </w:rPr>
+        <w:t>The model trained was one used to determine the minimum steps to reaching a goal in a minigrid environment. An 8x8 grid environment was chosen for</w:t>
+      </w:r>
+      <w:r>
+        <w:rPr>
+          <w:sz w:val="24"/>
+          <w:szCs w:val="24"/>
+        </w:rPr>
+        <w:t xml:space="preserve"> its</w:t>
+      </w:r>
+      <w:r>
+        <w:rPr>
+          <w:sz w:val="24"/>
+          <w:szCs w:val="24"/>
+        </w:rPr>
+        <w:t xml:space="preserve"> simplicity.</w:t>
+      </w:r>
+      <w:r>
+        <w:rPr>
+          <w:sz w:val="24"/>
+          <w:szCs w:val="24"/>
+        </w:rPr>
+        <w:t xml:space="preserve"> The list of actions available for the agent to take in this environment are: </w:t>
+      </w:r>
+    </w:p>
+    <w:p>
+      <w:pPr>
+        <w:pStyle w:val="ListParagraph"/>
+        <w:numPr>
+          <w:ilvl w:val="0"/>
+          <w:numId w:val="40"/>
+        </w:numPr>
+        <w:jc w:val="both"/>
+        <w:rPr>
+          <w:sz w:val="24"/>
+          <w:szCs w:val="24"/>
+        </w:rPr>
+      </w:pPr>
+      <w:r>
+        <w:rPr>
+          <w:sz w:val="24"/>
+          <w:szCs w:val="24"/>
+        </w:rPr>
+        <w:t>Turn Left</w:t>
+      </w:r>
+    </w:p>
+    <w:p>
+      <w:pPr>
+        <w:pStyle w:val="ListParagraph"/>
+        <w:numPr>
+          <w:ilvl w:val="0"/>
+          <w:numId w:val="40"/>
+        </w:numPr>
+        <w:jc w:val="both"/>
+        <w:rPr>
+          <w:sz w:val="24"/>
+          <w:szCs w:val="24"/>
+        </w:rPr>
+      </w:pPr>
+      <w:r>
+        <w:rPr>
+          <w:sz w:val="24"/>
+          <w:szCs w:val="24"/>
+        </w:rPr>
+        <w:t xml:space="preserve">Turn Right </w:t>
+      </w:r>
+    </w:p>
+    <w:p>
+      <w:pPr>
+        <w:pStyle w:val="ListParagraph"/>
+        <w:numPr>
+          <w:ilvl w:val="0"/>
+          <w:numId w:val="40"/>
+        </w:numPr>
+        <w:jc w:val="both"/>
+        <w:rPr>
+          <w:sz w:val="24"/>
+          <w:szCs w:val="24"/>
+        </w:rPr>
+      </w:pPr>
+      <w:r>
+        <w:rPr>
+          <w:sz w:val="24"/>
+          <w:szCs w:val="24"/>
+        </w:rPr>
+        <w:t>Move Forward</w:t>
+      </w:r>
+    </w:p>
+    <w:p>
+      <w:pPr>
+        <w:jc w:val="both"/>
+        <w:rPr>
+          <w:sz w:val="24"/>
+          <w:szCs w:val="24"/>
+        </w:rPr>
+      </w:pPr>
+    </w:p>
+    <w:p>
+      <w:pPr>
+        <w:jc w:val="both"/>
+        <w:rPr>
+          <w:sz w:val="24"/>
+          <w:szCs w:val="24"/>
+        </w:rPr>
+      </w:pPr>
+    </w:p>
+    <w:p>
+      <w:pPr>
+        <w:jc w:val="both"/>
+        <w:rPr>
+          <w:sz w:val="24"/>
+          <w:szCs w:val="24"/>
+        </w:rPr>
+      </w:pPr>
+      <w:r>
+        <w:rPr>
+          <w:sz w:val="24"/>
+          <w:szCs w:val="24"/>
+        </w:rPr>
+        <w:t>To develop a tabular q-learning model:</w:t>
+      </w:r>
+    </w:p>
+    <w:p>
+      <w:pPr>
+        <w:pStyle w:val="ListParagraph"/>
+        <w:numPr>
+          <w:ilvl w:val="0"/>
+          <w:numId w:val="39"/>
+        </w:numPr>
+        <w:jc w:val="both"/>
+        <w:rPr>
+          <w:sz w:val="24"/>
+          <w:szCs w:val="24"/>
+        </w:rPr>
+      </w:pPr>
+      <w:r>
+        <w:rPr>
+          <w:sz w:val="24"/>
+          <w:szCs w:val="24"/>
+        </w:rPr>
+        <w:t>Make the Minigrid Virtual Environment</w:t>
+      </w:r>
+    </w:p>
+    <w:p>
+      <w:pPr>
+        <w:pStyle w:val="ListParagraph"/>
+        <w:numPr>
+          <w:ilvl w:val="0"/>
+          <w:numId w:val="39"/>
+        </w:numPr>
+        <w:jc w:val="both"/>
+        <w:rPr>
+          <w:sz w:val="24"/>
+          <w:szCs w:val="24"/>
+        </w:rPr>
+      </w:pPr>
+      <w:r>
+        <w:rPr>
+          <w:sz w:val="24"/>
+          <w:szCs w:val="24"/>
+        </w:rPr>
+        <w:t>Define an Empty Q-Table</w:t>
+      </w:r>
+    </w:p>
+    <w:p>
+      <w:pPr>
+        <w:pStyle w:val="ListParagraph"/>
+        <w:numPr>
+          <w:ilvl w:val="0"/>
+          <w:numId w:val="39"/>
+        </w:numPr>
+        <w:jc w:val="both"/>
+        <w:rPr>
+          <w:sz w:val="24"/>
+          <w:szCs w:val="24"/>
+        </w:rPr>
+      </w:pPr>
+      <w:r>
+        <w:rPr>
+          <w:sz w:val="24"/>
+          <w:szCs w:val="24"/>
+        </w:rPr>
+        <w:t xml:space="preserve">Create an Episode Loop to Train the Agent </w:t>
+      </w:r>
+    </w:p>
+    <w:p>
+      <w:pPr>
+        <w:pStyle w:val="ListParagraph"/>
+        <w:numPr>
+          <w:ilvl w:val="1"/>
+          <w:numId w:val="39"/>
+        </w:numPr>
+        <w:jc w:val="both"/>
+        <w:rPr>
+          <w:sz w:val="24"/>
+          <w:szCs w:val="24"/>
+        </w:rPr>
+      </w:pPr>
+      <w:r>
+        <w:rPr>
+          <w:sz w:val="24"/>
+          <w:szCs w:val="24"/>
+        </w:rPr>
+        <w:t>Reset the Environment</w:t>
+      </w:r>
+    </w:p>
+    <w:p>
+      <w:pPr>
+        <w:pStyle w:val="ListParagraph"/>
+        <w:numPr>
+          <w:ilvl w:val="1"/>
+          <w:numId w:val="39"/>
+        </w:numPr>
+        <w:jc w:val="both"/>
+        <w:rPr>
+          <w:sz w:val="24"/>
+          <w:szCs w:val="24"/>
+        </w:rPr>
+      </w:pPr>
+      <w:r>
+        <w:rPr>
+          <w:sz w:val="24"/>
+          <w:szCs w:val="24"/>
+        </w:rPr>
+        <w:t>Set</w:t>
+      </w:r>
+      <w:r>
+        <w:rPr>
+          <w:sz w:val="24"/>
+          <w:szCs w:val="24"/>
+        </w:rPr>
+        <w:t xml:space="preserve"> Current</w:t>
+      </w:r>
+      <w:r>
+        <w:rPr>
+          <w:sz w:val="24"/>
+          <w:szCs w:val="24"/>
+        </w:rPr>
+        <w:t xml:space="preserve"> Episode </w:t>
+      </w:r>
+      <w:r>
+        <w:rPr>
+          <w:color w:val="006600"/>
+          <w:sz w:val="24"/>
+          <w:szCs w:val="24"/>
+        </w:rPr>
+        <w:t>Loss</w:t>
+      </w:r>
+      <w:r>
+        <w:rPr>
+          <w:sz w:val="24"/>
+          <w:szCs w:val="24"/>
+        </w:rPr>
+        <w:t xml:space="preserve">, </w:t>
+      </w:r>
+      <w:r>
+        <w:rPr>
+          <w:color w:val="7030A0"/>
+          <w:sz w:val="24"/>
+          <w:szCs w:val="24"/>
+        </w:rPr>
+        <w:t xml:space="preserve">Reward </w:t>
+      </w:r>
+      <w:r>
+        <w:rPr>
+          <w:sz w:val="24"/>
+          <w:szCs w:val="24"/>
+        </w:rPr>
+        <w:t xml:space="preserve">and </w:t>
+      </w:r>
+      <w:r>
+        <w:rPr>
+          <w:color w:val="00B0F0"/>
+          <w:sz w:val="24"/>
+          <w:szCs w:val="24"/>
+        </w:rPr>
+        <w:t xml:space="preserve">Steps </w:t>
+      </w:r>
+      <w:r>
+        <w:rPr>
+          <w:sz w:val="24"/>
+          <w:szCs w:val="24"/>
+        </w:rPr>
+        <w:t>to Zero</w:t>
+      </w:r>
+    </w:p>
+    <w:p>
+      <w:pPr>
+        <w:pStyle w:val="ListParagraph"/>
+        <w:numPr>
+          <w:ilvl w:val="1"/>
+          <w:numId w:val="39"/>
+        </w:numPr>
+        <w:jc w:val="both"/>
+        <w:rPr>
+          <w:sz w:val="24"/>
+          <w:szCs w:val="24"/>
+        </w:rPr>
+      </w:pPr>
+      <w:r>
+        <w:rPr>
+          <w:sz w:val="24"/>
+          <w:szCs w:val="24"/>
+        </w:rPr>
+        <w:t xml:space="preserve">Extract the </w:t>
+      </w:r>
+      <w:r>
+        <w:rPr>
+          <w:color w:val="E36C0A" w:themeColor="accent6" w:themeShade="BF"/>
+          <w:sz w:val="24"/>
+          <w:szCs w:val="24"/>
+        </w:rPr>
+        <w:t xml:space="preserve">Current State </w:t>
+      </w:r>
+      <w:r>
+        <w:rPr>
+          <w:sz w:val="24"/>
+          <w:szCs w:val="24"/>
+        </w:rPr>
+        <w:t>&amp; Hash the State</w:t>
+      </w:r>
+    </w:p>
+    <w:p>
+      <w:pPr>
+        <w:pStyle w:val="ListParagraph"/>
+        <w:numPr>
+          <w:ilvl w:val="1"/>
+          <w:numId w:val="39"/>
+        </w:numPr>
+        <w:jc w:val="both"/>
+        <w:rPr>
+          <w:sz w:val="24"/>
+          <w:szCs w:val="24"/>
+        </w:rPr>
+      </w:pPr>
+      <w:r>
+        <w:rPr>
+          <w:sz w:val="24"/>
+          <w:szCs w:val="24"/>
+        </w:rPr>
+        <w:t xml:space="preserve">Loop though Main </w:t>
+      </w:r>
+      <w:r>
+        <w:rPr>
+          <w:sz w:val="24"/>
+          <w:szCs w:val="24"/>
+        </w:rPr>
+        <w:t>Reinforcement Learning</w:t>
+      </w:r>
+      <w:r>
+        <w:rPr>
+          <w:sz w:val="24"/>
+          <w:szCs w:val="24"/>
+        </w:rPr>
+        <w:t xml:space="preserve"> Step</w:t>
+      </w:r>
+      <w:r>
+        <w:rPr>
+          <w:sz w:val="24"/>
+          <w:szCs w:val="24"/>
+        </w:rPr>
+        <w:t xml:space="preserve"> </w:t>
+      </w:r>
+      <w:r>
+        <w:rPr>
+          <w:sz w:val="24"/>
+          <w:szCs w:val="24"/>
+        </w:rPr>
+        <w:t>Loop</w:t>
+      </w:r>
+      <w:r>
+        <w:rPr>
+          <w:sz w:val="24"/>
+          <w:szCs w:val="24"/>
+        </w:rPr>
+        <w:t xml:space="preserve"> (4)</w:t>
+      </w:r>
+    </w:p>
+    <w:p>
+      <w:pPr>
+        <w:pStyle w:val="ListParagraph"/>
+        <w:numPr>
+          <w:ilvl w:val="1"/>
+          <w:numId w:val="39"/>
+        </w:numPr>
+        <w:jc w:val="both"/>
+        <w:rPr>
+          <w:sz w:val="24"/>
+          <w:szCs w:val="24"/>
+        </w:rPr>
+      </w:pPr>
+      <w:r>
+        <w:rPr>
+          <w:sz w:val="24"/>
+          <w:szCs w:val="24"/>
+        </w:rPr>
+        <w:t>Decay Epsilon</w:t>
+      </w:r>
+    </w:p>
+    <w:p>
+      <w:pPr>
+        <w:pStyle w:val="ListParagraph"/>
+        <w:numPr>
+          <w:ilvl w:val="1"/>
+          <w:numId w:val="39"/>
+        </w:numPr>
+        <w:jc w:val="both"/>
+        <w:rPr>
+          <w:sz w:val="24"/>
+          <w:szCs w:val="24"/>
+        </w:rPr>
+      </w:pPr>
+      <w:r>
+        <w:rPr>
+          <w:sz w:val="24"/>
+          <w:szCs w:val="24"/>
+        </w:rPr>
+        <w:t xml:space="preserve">Log Values to </w:t>
+      </w:r>
+      <w:r>
+        <w:rPr>
+          <w:sz w:val="24"/>
+          <w:szCs w:val="24"/>
+        </w:rPr>
+        <w:t>Tensorboard</w:t>
+      </w:r>
+      <w:r>
+        <w:rPr>
+          <w:sz w:val="24"/>
+          <w:szCs w:val="24"/>
+        </w:rPr>
+        <w:t xml:space="preserve"> </w:t>
+      </w:r>
+    </w:p>
+    <w:p>
+      <w:pPr>
+        <w:pStyle w:val="ListParagraph"/>
+        <w:numPr>
+          <w:ilvl w:val="0"/>
+          <w:numId w:val="39"/>
+        </w:numPr>
+        <w:jc w:val="both"/>
+        <w:rPr>
+          <w:sz w:val="24"/>
+          <w:szCs w:val="24"/>
+        </w:rPr>
+      </w:pPr>
+      <w:r>
+        <w:rPr>
+          <w:sz w:val="24"/>
+          <w:szCs w:val="24"/>
+        </w:rPr>
+        <w:t>Create</w:t>
+      </w:r>
+      <w:r>
+        <w:rPr>
+          <w:sz w:val="24"/>
+          <w:szCs w:val="24"/>
+        </w:rPr>
+        <w:t xml:space="preserve"> the</w:t>
+      </w:r>
+      <w:r>
+        <w:rPr>
+          <w:sz w:val="24"/>
+          <w:szCs w:val="24"/>
+        </w:rPr>
+        <w:t xml:space="preserve"> Main Reinforcement Learning Step Loop:</w:t>
+      </w:r>
+    </w:p>
+    <w:p>
+      <w:pPr>
+        <w:pStyle w:val="ListParagraph"/>
+        <w:numPr>
+          <w:ilvl w:val="1"/>
+          <w:numId w:val="39"/>
+        </w:numPr>
+        <w:jc w:val="both"/>
+        <w:rPr>
+          <w:sz w:val="24"/>
+          <w:szCs w:val="24"/>
+        </w:rPr>
+      </w:pPr>
+      <w:r>
+        <w:rPr>
+          <w:sz w:val="24"/>
+          <w:szCs w:val="24"/>
+        </w:rPr>
+        <w:t>Perform Epsilon Greedy Exploration:</w:t>
+      </w:r>
+    </w:p>
+    <w:p>
+      <w:pPr>
+        <w:pStyle w:val="ListParagraph"/>
+        <w:numPr>
+          <w:ilvl w:val="2"/>
+          <w:numId w:val="39"/>
+        </w:numPr>
+        <w:jc w:val="both"/>
+        <w:rPr>
+          <w:sz w:val="24"/>
+          <w:szCs w:val="24"/>
+        </w:rPr>
+      </w:pPr>
+      <w:r>
+        <w:rPr>
+          <w:sz w:val="24"/>
+          <w:szCs w:val="24"/>
+        </w:rPr>
+        <w:t xml:space="preserve">Explore the Environment - Picks Random </w:t>
+      </w:r>
+      <w:r>
+        <w:rPr>
+          <w:color w:val="D60093"/>
+          <w:sz w:val="24"/>
+          <w:szCs w:val="24"/>
+        </w:rPr>
+        <w:t>Action</w:t>
+      </w:r>
+      <w:r>
+        <w:rPr>
+          <w:sz w:val="24"/>
+          <w:szCs w:val="24"/>
+        </w:rPr>
+        <w:t>, or</w:t>
+      </w:r>
+    </w:p>
+    <w:p>
+      <w:pPr>
+        <w:pStyle w:val="ListParagraph"/>
+        <w:numPr>
+          <w:ilvl w:val="2"/>
+          <w:numId w:val="39"/>
+        </w:numPr>
+        <w:jc w:val="both"/>
+        <w:rPr>
+          <w:sz w:val="24"/>
+          <w:szCs w:val="24"/>
+        </w:rPr>
+      </w:pPr>
+      <w:r>
+        <w:rPr>
+          <w:sz w:val="24"/>
+          <w:szCs w:val="24"/>
+        </w:rPr>
+        <w:t xml:space="preserve">Exploit the Environment – Select </w:t>
+      </w:r>
+      <w:r>
+        <w:rPr>
+          <w:color w:val="D60093"/>
+          <w:sz w:val="24"/>
+          <w:szCs w:val="24"/>
+        </w:rPr>
+        <w:t xml:space="preserve">Action </w:t>
+      </w:r>
+      <w:r>
+        <w:rPr>
+          <w:sz w:val="24"/>
+          <w:szCs w:val="24"/>
+        </w:rPr>
+        <w:t xml:space="preserve">for </w:t>
+      </w:r>
+      <w:r>
+        <w:rPr>
+          <w:sz w:val="24"/>
+          <w:szCs w:val="24"/>
+        </w:rPr>
+        <w:t xml:space="preserve">Max Value Function at the </w:t>
+      </w:r>
+      <w:r>
+        <w:rPr>
+          <w:color w:val="E36C0A" w:themeColor="accent6" w:themeShade="BF"/>
+          <w:sz w:val="24"/>
+          <w:szCs w:val="24"/>
+        </w:rPr>
+        <w:t>Current State</w:t>
+      </w:r>
+    </w:p>
+    <w:p>
+      <w:pPr>
+        <w:pStyle w:val="ListParagraph"/>
+        <w:numPr>
+          <w:ilvl w:val="1"/>
+          <w:numId w:val="39"/>
+        </w:numPr>
+        <w:jc w:val="both"/>
+        <w:rPr>
+          <w:sz w:val="24"/>
+          <w:szCs w:val="24"/>
+        </w:rPr>
+      </w:pPr>
+      <w:r>
+        <w:rPr>
+          <w:sz w:val="24"/>
+          <w:szCs w:val="24"/>
+        </w:rPr>
+        <w:t xml:space="preserve">Extract the Step Information for Taking the </w:t>
+      </w:r>
+      <w:r>
+        <w:rPr>
+          <w:color w:val="D60093"/>
+          <w:sz w:val="24"/>
+          <w:szCs w:val="24"/>
+        </w:rPr>
+        <w:t>Action</w:t>
+      </w:r>
+      <w:r>
+        <w:rPr>
+          <w:color w:val="D60093"/>
+          <w:sz w:val="24"/>
+          <w:szCs w:val="24"/>
+        </w:rPr>
+        <w:t xml:space="preserve"> </w:t>
+      </w:r>
+    </w:p>
+    <w:p>
+      <w:pPr>
+        <w:pStyle w:val="ListParagraph"/>
+        <w:ind w:left="1440" w:firstLine="0"/>
+        <w:jc w:val="both"/>
+        <w:rPr>
+          <w:sz w:val="24"/>
+          <w:szCs w:val="24"/>
+        </w:rPr>
+      </w:pPr>
+      <w:r>
+        <w:rPr>
+          <w:sz w:val="24"/>
+          <w:szCs w:val="24"/>
+        </w:rPr>
+        <w:t xml:space="preserve">(i.e. </w:t>
+      </w:r>
+      <w:r>
+        <w:rPr>
+          <w:color w:val="0070C0"/>
+          <w:sz w:val="24"/>
+          <w:szCs w:val="24"/>
+        </w:rPr>
+        <w:t>Observation</w:t>
+      </w:r>
+      <w:r>
+        <w:rPr>
+          <w:sz w:val="24"/>
+          <w:szCs w:val="24"/>
+        </w:rPr>
+        <w:t xml:space="preserve">, </w:t>
+      </w:r>
+      <w:r>
+        <w:rPr>
+          <w:color w:val="7030A0"/>
+          <w:sz w:val="24"/>
+          <w:szCs w:val="24"/>
+        </w:rPr>
+        <w:t>Reward</w:t>
+      </w:r>
+      <w:r>
+        <w:rPr>
+          <w:sz w:val="24"/>
+          <w:szCs w:val="24"/>
+        </w:rPr>
+        <w:t xml:space="preserve">, </w:t>
+      </w:r>
+      <w:r>
+        <w:rPr>
+          <w:color w:val="C00000"/>
+          <w:sz w:val="24"/>
+          <w:szCs w:val="24"/>
+        </w:rPr>
+        <w:t>Done</w:t>
+      </w:r>
+      <w:r>
+        <w:rPr>
+          <w:sz w:val="24"/>
+          <w:szCs w:val="24"/>
+        </w:rPr>
+        <w:t xml:space="preserve">, </w:t>
+      </w:r>
+      <w:r>
+        <w:rPr>
+          <w:color w:val="00D200"/>
+          <w:sz w:val="24"/>
+          <w:szCs w:val="24"/>
+        </w:rPr>
+        <w:t>Truncated</w:t>
+      </w:r>
+      <w:r>
+        <w:rPr>
+          <w:sz w:val="24"/>
+          <w:szCs w:val="24"/>
+        </w:rPr>
+        <w:t>)</w:t>
+      </w:r>
+    </w:p>
+    <w:p>
+      <w:pPr>
+        <w:pStyle w:val="ListParagraph"/>
+        <w:numPr>
+          <w:ilvl w:val="1"/>
+          <w:numId w:val="39"/>
+        </w:numPr>
+        <w:jc w:val="both"/>
+        <w:rPr>
+          <w:sz w:val="24"/>
+          <w:szCs w:val="24"/>
+        </w:rPr>
+      </w:pPr>
+      <w:r>
+        <w:rPr>
+          <w:sz w:val="24"/>
+          <w:szCs w:val="24"/>
+        </w:rPr>
+        <w:lastRenderedPageBreak/>
+        <w:t xml:space="preserve">Extract the </w:t>
+      </w:r>
+      <w:r>
+        <w:rPr>
+          <w:color w:val="984806" w:themeColor="accent6" w:themeShade="80"/>
+          <w:sz w:val="24"/>
+          <w:szCs w:val="24"/>
+        </w:rPr>
+        <w:t xml:space="preserve">Next State </w:t>
+      </w:r>
+      <w:r>
+        <w:rPr>
+          <w:sz w:val="24"/>
+          <w:szCs w:val="24"/>
+        </w:rPr>
+        <w:t xml:space="preserve">from the </w:t>
+      </w:r>
+      <w:r>
+        <w:rPr>
+          <w:color w:val="0070C0"/>
+          <w:sz w:val="24"/>
+          <w:szCs w:val="24"/>
+        </w:rPr>
+        <w:t xml:space="preserve">Observation </w:t>
+      </w:r>
+      <w:r>
+        <w:rPr>
+          <w:sz w:val="24"/>
+          <w:szCs w:val="24"/>
+        </w:rPr>
+        <w:t>&amp; Hash the State</w:t>
+      </w:r>
+    </w:p>
+    <w:p>
+      <w:pPr>
+        <w:pStyle w:val="ListParagraph"/>
+        <w:numPr>
+          <w:ilvl w:val="1"/>
+          <w:numId w:val="39"/>
+        </w:numPr>
+        <w:jc w:val="both"/>
+        <w:rPr>
+          <w:sz w:val="24"/>
+          <w:szCs w:val="24"/>
+        </w:rPr>
+      </w:pPr>
+      <w:r>
+        <w:rPr>
+          <w:sz w:val="24"/>
+          <w:szCs w:val="24"/>
+        </w:rPr>
+        <w:t>Update the Q-Table using the Bellman Equation</w:t>
+      </w:r>
+    </w:p>
+    <w:p>
+      <w:pPr>
+        <w:pStyle w:val="ListParagraph"/>
+        <w:numPr>
+          <w:ilvl w:val="2"/>
+          <w:numId w:val="39"/>
+        </w:numPr>
+        <w:jc w:val="both"/>
+        <w:rPr>
+          <w:sz w:val="24"/>
+          <w:szCs w:val="24"/>
+        </w:rPr>
+      </w:pPr>
+      <w:r>
+        <w:rPr>
+          <w:sz w:val="24"/>
+          <w:szCs w:val="24"/>
+        </w:rPr>
+        <w:t xml:space="preserve">E = </w:t>
+      </w:r>
+    </w:p>
+    <w:p>
+      <w:pPr>
+        <w:pStyle w:val="ListParagraph"/>
+        <w:numPr>
+          <w:ilvl w:val="2"/>
+          <w:numId w:val="39"/>
+        </w:numPr>
+        <w:jc w:val="both"/>
+        <w:rPr>
+          <w:sz w:val="24"/>
+          <w:szCs w:val="24"/>
+        </w:rPr>
+      </w:pPr>
+      <w:r>
+        <w:rPr>
+          <w:sz w:val="24"/>
+          <w:szCs w:val="24"/>
+        </w:rPr>
+        <w:t xml:space="preserve">L = </w:t>
+      </w:r>
+    </w:p>
+    <w:p>
+      <w:pPr>
+        <w:pStyle w:val="ListParagraph"/>
+        <w:numPr>
+          <w:ilvl w:val="2"/>
+          <w:numId w:val="39"/>
+        </w:numPr>
+        <w:jc w:val="both"/>
+        <w:rPr>
+          <w:sz w:val="24"/>
+          <w:szCs w:val="24"/>
+        </w:rPr>
+      </w:pPr>
+      <w:r>
+        <w:rPr>
+          <w:sz w:val="24"/>
+          <w:szCs w:val="24"/>
+        </w:rPr>
+        <w:t>Q [S, A] =</w:t>
+      </w:r>
+    </w:p>
+    <w:p>
+      <w:pPr>
+        <w:pStyle w:val="ListParagraph"/>
+        <w:numPr>
+          <w:ilvl w:val="1"/>
+          <w:numId w:val="39"/>
+        </w:numPr>
+        <w:jc w:val="both"/>
+        <w:rPr>
+          <w:sz w:val="24"/>
+          <w:szCs w:val="24"/>
+        </w:rPr>
+      </w:pPr>
+      <w:r>
+        <w:rPr>
+          <w:sz w:val="24"/>
+          <w:szCs w:val="24"/>
+        </w:rPr>
+        <w:t xml:space="preserve">Increment </w:t>
+      </w:r>
+      <w:r>
+        <w:rPr>
+          <w:color w:val="00B0F0"/>
+          <w:sz w:val="24"/>
+          <w:szCs w:val="24"/>
+        </w:rPr>
+        <w:t xml:space="preserve">Step </w:t>
+      </w:r>
+      <w:r>
+        <w:rPr>
+          <w:sz w:val="24"/>
+          <w:szCs w:val="24"/>
+        </w:rPr>
+        <w:t>Count</w:t>
+      </w:r>
+    </w:p>
+    <w:p>
+      <w:pPr>
+        <w:pStyle w:val="ListParagraph"/>
+        <w:numPr>
+          <w:ilvl w:val="1"/>
+          <w:numId w:val="39"/>
+        </w:numPr>
+        <w:jc w:val="both"/>
+        <w:rPr>
+          <w:sz w:val="24"/>
+          <w:szCs w:val="24"/>
+        </w:rPr>
+      </w:pPr>
+      <w:r>
+        <w:rPr>
+          <w:sz w:val="24"/>
+          <w:szCs w:val="24"/>
+        </w:rPr>
+        <w:t xml:space="preserve">Calculate the Accumulated </w:t>
+      </w:r>
+      <w:r>
+        <w:rPr>
+          <w:color w:val="7030A0"/>
+          <w:sz w:val="24"/>
+          <w:szCs w:val="24"/>
+        </w:rPr>
+        <w:t>Rewards</w:t>
+      </w:r>
+    </w:p>
+    <w:p>
+      <w:pPr>
+        <w:pStyle w:val="ListParagraph"/>
+        <w:numPr>
+          <w:ilvl w:val="1"/>
+          <w:numId w:val="39"/>
+        </w:numPr>
+        <w:jc w:val="both"/>
+        <w:rPr>
+          <w:sz w:val="24"/>
+          <w:szCs w:val="24"/>
+        </w:rPr>
+      </w:pPr>
+      <w:r>
+        <w:rPr>
+          <w:sz w:val="24"/>
+          <w:szCs w:val="24"/>
+        </w:rPr>
+        <w:t xml:space="preserve">Move to the </w:t>
+      </w:r>
+      <w:r>
+        <w:rPr>
+          <w:color w:val="984806" w:themeColor="accent6" w:themeShade="80"/>
+          <w:sz w:val="24"/>
+          <w:szCs w:val="24"/>
+        </w:rPr>
+        <w:t>Next State</w:t>
+      </w:r>
+    </w:p>
+    <w:p>
+      <w:pPr>
+        <w:pStyle w:val="ListParagraph"/>
+        <w:numPr>
+          <w:ilvl w:val="1"/>
+          <w:numId w:val="39"/>
+        </w:numPr>
+        <w:jc w:val="both"/>
+        <w:rPr>
+          <w:sz w:val="24"/>
+          <w:szCs w:val="24"/>
+        </w:rPr>
+      </w:pPr>
+      <w:r>
+        <w:rPr>
+          <w:sz w:val="24"/>
+          <w:szCs w:val="24"/>
+        </w:rPr>
+        <w:t>Break Loop</w:t>
+      </w:r>
+    </w:p>
+    <w:p>
+      <w:pPr>
+        <w:pStyle w:val="ListParagraph"/>
+        <w:numPr>
+          <w:ilvl w:val="2"/>
+          <w:numId w:val="39"/>
+        </w:numPr>
+        <w:jc w:val="both"/>
+        <w:rPr>
+          <w:sz w:val="24"/>
+          <w:szCs w:val="24"/>
+        </w:rPr>
+      </w:pPr>
+      <w:r>
+        <w:rPr>
+          <w:sz w:val="24"/>
+          <w:szCs w:val="24"/>
+        </w:rPr>
+        <w:t>Goal is Reached (</w:t>
+      </w:r>
+      <w:r>
+        <w:rPr>
+          <w:color w:val="C00000"/>
+          <w:sz w:val="24"/>
+          <w:szCs w:val="24"/>
+        </w:rPr>
+        <w:t>Done</w:t>
+      </w:r>
+      <w:r>
+        <w:rPr>
+          <w:sz w:val="24"/>
+          <w:szCs w:val="24"/>
+        </w:rPr>
+        <w:t>)</w:t>
+      </w:r>
+      <w:r>
+        <w:rPr>
+          <w:sz w:val="24"/>
+          <w:szCs w:val="24"/>
+        </w:rPr>
+        <w:t>,</w:t>
+      </w:r>
+      <w:r>
+        <w:rPr>
+          <w:sz w:val="24"/>
+          <w:szCs w:val="24"/>
+        </w:rPr>
+        <w:t xml:space="preserve"> or</w:t>
+      </w:r>
+      <w:r>
+        <w:rPr>
+          <w:sz w:val="24"/>
+          <w:szCs w:val="24"/>
+        </w:rPr>
+        <w:t xml:space="preserve"> </w:t>
+      </w:r>
+    </w:p>
+    <w:p>
+      <w:pPr>
+        <w:pStyle w:val="ListParagraph"/>
+        <w:numPr>
+          <w:ilvl w:val="2"/>
+          <w:numId w:val="39"/>
+        </w:numPr>
+        <w:jc w:val="both"/>
+        <w:rPr>
+          <w:sz w:val="24"/>
+          <w:szCs w:val="24"/>
+        </w:rPr>
+      </w:pPr>
+      <w:r>
+        <w:rPr>
+          <w:sz w:val="24"/>
+          <w:szCs w:val="24"/>
+        </w:rPr>
+        <w:t>Max Steps Reached (</w:t>
+      </w:r>
+      <w:r>
+        <w:rPr>
+          <w:color w:val="00D200"/>
+          <w:sz w:val="24"/>
+          <w:szCs w:val="24"/>
+        </w:rPr>
+        <w:t>Truncated</w:t>
+      </w:r>
+      <w:r>
+        <w:rPr>
+          <w:sz w:val="24"/>
+          <w:szCs w:val="24"/>
+        </w:rPr>
+        <w:t>)</w:t>
+      </w:r>
+    </w:p>
+    <w:p>
+      <w:pPr>
+        <w:jc w:val="both"/>
+        <w:rPr>
+          <w:sz w:val="24"/>
+          <w:szCs w:val="24"/>
+        </w:rPr>
+      </w:pPr>
+    </w:p>
+    <w:p>
+      <w:pPr>
+        <w:jc w:val="both"/>
+        <w:rPr>
+          <w:sz w:val="24"/>
+          <w:szCs w:val="24"/>
+        </w:rPr>
+      </w:pPr>
+      <w:r>
+        <w:rPr>
+          <w:sz w:val="24"/>
+          <w:szCs w:val="24"/>
+        </w:rPr>
+        <w:t>The model</w:t>
+      </w:r>
+      <w:r>
+        <w:rPr>
+          <w:sz w:val="24"/>
+          <w:szCs w:val="24"/>
+        </w:rPr>
+        <w:t>’s hyperparameters were then tuned using Optuna</w:t>
+      </w:r>
+      <w:r>
+        <w:rPr>
+          <w:sz w:val="24"/>
+          <w:szCs w:val="24"/>
+        </w:rPr>
+        <w:t xml:space="preserve"> to establish the best </w:t>
+      </w:r>
+      <w:r>
+        <w:rPr>
+          <w:sz w:val="24"/>
+          <w:szCs w:val="24"/>
+        </w:rPr>
+        <w:t xml:space="preserve">baseline </w:t>
+      </w:r>
+      <w:r>
+        <w:rPr>
+          <w:sz w:val="24"/>
+          <w:szCs w:val="24"/>
+        </w:rPr>
+        <w:t>performance. This process is discussed further in section 3.1.3.</w:t>
       </w:r>
     </w:p>
     <w:p>
@@ -6133,7 +7342,6 @@
       </w:pPr>
       <w:bookmarkStart w:id="38" w:name="_Toc235529088"/>
       <w:r>
-        <w:lastRenderedPageBreak/>
         <w:t>Translation to Deep Q-Network</w:t>
       </w:r>
       <w:bookmarkEnd w:id="38"/>
@@ -6281,7 +7489,7 @@
         <w:pStyle w:val="Heading1"/>
       </w:pPr>
       <w:bookmarkStart w:id="45" w:name="_Toc235529095"/>
-      <w:bookmarkEnd w:id="34"/>
+      <w:bookmarkEnd w:id="35"/>
       <w:r>
         <w:lastRenderedPageBreak/>
         <w:t>Planned Activities</w:t>
@@ -6336,6 +7544,7 @@
       </w:pPr>
       <w:bookmarkStart w:id="48" w:name="_Toc235529098"/>
       <w:r>
+        <w:lastRenderedPageBreak/>
         <w:t>Camera Integration &amp; Robustness Testing</w:t>
       </w:r>
       <w:bookmarkEnd w:id="48"/>
@@ -6358,6 +7567,7 @@
       </w:pPr>
       <w:bookmarkStart w:id="49" w:name="_Toc235529099"/>
       <w:r>
+        <w:lastRenderedPageBreak/>
         <w:t>Results and Discussion</w:t>
       </w:r>
       <w:bookmarkEnd w:id="49"/>
@@ -6542,7 +7752,7 @@
       </w:r>
     </w:p>
     <w:sectPr>
-      <w:footerReference w:type="default" r:id="rId21"/>
+      <w:footerReference w:type="default" r:id="rId22"/>
       <w:endnotePr>
         <w:numStart w:val="6"/>
       </w:endnotePr>
@@ -8352,6 +9562,119 @@
     </w:lvl>
   </w:abstractNum>
   <w:abstractNum w:abstractNumId="19" w15:restartNumberingAfterBreak="0">
+    <w:nsid w:val="1B8B66FC"/>
+    <w:multiLevelType w:val="hybridMultilevel"/>
+    <w:tmpl w:val="6158D696"/>
+    <w:lvl w:ilvl="0" w:tplc="1C090001">
+      <w:start w:val="1"/>
+      <w:numFmt w:val="bullet"/>
+      <w:lvlText w:val=""/>
+      <w:lvlJc w:val="left"/>
+      <w:pPr>
+        <w:ind w:left="1440" w:hanging="360"/>
+      </w:pPr>
+      <w:rPr>
+        <w:rFonts w:ascii="Symbol" w:hAnsi="Symbol" w:hint="default"/>
+      </w:rPr>
+    </w:lvl>
+    <w:lvl w:ilvl="1" w:tplc="1C090003" w:tentative="1">
+      <w:start w:val="1"/>
+      <w:numFmt w:val="bullet"/>
+      <w:lvlText w:val="o"/>
+      <w:lvlJc w:val="left"/>
+      <w:pPr>
+        <w:ind w:left="2160" w:hanging="360"/>
+      </w:pPr>
+      <w:rPr>
+        <w:rFonts w:ascii="Courier New" w:hAnsi="Courier New" w:cs="Courier New" w:hint="default"/>
+      </w:rPr>
+    </w:lvl>
+    <w:lvl w:ilvl="2" w:tplc="1C090005" w:tentative="1">
+      <w:start w:val="1"/>
+      <w:numFmt w:val="bullet"/>
+      <w:lvlText w:val=""/>
+      <w:lvlJc w:val="left"/>
+      <w:pPr>
+        <w:ind w:left="2880" w:hanging="360"/>
+      </w:pPr>
+      <w:rPr>
+        <w:rFonts w:ascii="Wingdings" w:hAnsi="Wingdings" w:hint="default"/>
+      </w:rPr>
+    </w:lvl>
+    <w:lvl w:ilvl="3" w:tplc="1C090001" w:tentative="1">
+      <w:start w:val="1"/>
+      <w:numFmt w:val="bullet"/>
+      <w:lvlText w:val=""/>
+      <w:lvlJc w:val="left"/>
+      <w:pPr>
+        <w:ind w:left="3600" w:hanging="360"/>
+      </w:pPr>
+      <w:rPr>
+        <w:rFonts w:ascii="Symbol" w:hAnsi="Symbol" w:hint="default"/>
+      </w:rPr>
+    </w:lvl>
+    <w:lvl w:ilvl="4" w:tplc="1C090003" w:tentative="1">
+      <w:start w:val="1"/>
+      <w:numFmt w:val="bullet"/>
+      <w:lvlText w:val="o"/>
+      <w:lvlJc w:val="left"/>
+      <w:pPr>
+        <w:ind w:left="4320" w:hanging="360"/>
+      </w:pPr>
+      <w:rPr>
+        <w:rFonts w:ascii="Courier New" w:hAnsi="Courier New" w:cs="Courier New" w:hint="default"/>
+      </w:rPr>
+    </w:lvl>
+    <w:lvl w:ilvl="5" w:tplc="1C090005" w:tentative="1">
+      <w:start w:val="1"/>
+      <w:numFmt w:val="bullet"/>
+      <w:lvlText w:val=""/>
+      <w:lvlJc w:val="left"/>
+      <w:pPr>
+        <w:ind w:left="5040" w:hanging="360"/>
+      </w:pPr>
+      <w:rPr>
+        <w:rFonts w:ascii="Wingdings" w:hAnsi="Wingdings" w:hint="default"/>
+      </w:rPr>
+    </w:lvl>
+    <w:lvl w:ilvl="6" w:tplc="1C090001" w:tentative="1">
+      <w:start w:val="1"/>
+      <w:numFmt w:val="bullet"/>
+      <w:lvlText w:val=""/>
+      <w:lvlJc w:val="left"/>
+      <w:pPr>
+        <w:ind w:left="5760" w:hanging="360"/>
+      </w:pPr>
+      <w:rPr>
+        <w:rFonts w:ascii="Symbol" w:hAnsi="Symbol" w:hint="default"/>
+      </w:rPr>
+    </w:lvl>
+    <w:lvl w:ilvl="7" w:tplc="1C090003" w:tentative="1">
+      <w:start w:val="1"/>
+      <w:numFmt w:val="bullet"/>
+      <w:lvlText w:val="o"/>
+      <w:lvlJc w:val="left"/>
+      <w:pPr>
+        <w:ind w:left="6480" w:hanging="360"/>
+      </w:pPr>
+      <w:rPr>
+        <w:rFonts w:ascii="Courier New" w:hAnsi="Courier New" w:cs="Courier New" w:hint="default"/>
+      </w:rPr>
+    </w:lvl>
+    <w:lvl w:ilvl="8" w:tplc="1C090005" w:tentative="1">
+      <w:start w:val="1"/>
+      <w:numFmt w:val="bullet"/>
+      <w:lvlText w:val=""/>
+      <w:lvlJc w:val="left"/>
+      <w:pPr>
+        <w:ind w:left="7200" w:hanging="360"/>
+      </w:pPr>
+      <w:rPr>
+        <w:rFonts w:ascii="Wingdings" w:hAnsi="Wingdings" w:hint="default"/>
+      </w:rPr>
+    </w:lvl>
+  </w:abstractNum>
+  <w:abstractNum w:abstractNumId="20" w15:restartNumberingAfterBreak="0">
     <w:nsid w:val="34677F91"/>
     <w:multiLevelType w:val="hybridMultilevel"/>
     <w:tmpl w:val="418C249E"/>
@@ -8491,7 +9814,93 @@
       </w:rPr>
     </w:lvl>
   </w:abstractNum>
-  <w:abstractNum w:abstractNumId="20" w15:restartNumberingAfterBreak="0">
+  <w:abstractNum w:abstractNumId="21" w15:restartNumberingAfterBreak="0">
+    <w:nsid w:val="3A3C4CB1"/>
+    <w:multiLevelType w:val="hybridMultilevel"/>
+    <w:tmpl w:val="C03AFF6C"/>
+    <w:lvl w:ilvl="0" w:tplc="1C09000F">
+      <w:start w:val="1"/>
+      <w:numFmt w:val="decimal"/>
+      <w:lvlText w:val="%1."/>
+      <w:lvlJc w:val="left"/>
+      <w:pPr>
+        <w:ind w:left="720" w:hanging="360"/>
+      </w:pPr>
+    </w:lvl>
+    <w:lvl w:ilvl="1" w:tplc="1C090019">
+      <w:start w:val="1"/>
+      <w:numFmt w:val="lowerLetter"/>
+      <w:lvlText w:val="%2."/>
+      <w:lvlJc w:val="left"/>
+      <w:pPr>
+        <w:ind w:left="1440" w:hanging="360"/>
+      </w:pPr>
+    </w:lvl>
+    <w:lvl w:ilvl="2" w:tplc="1C09001B">
+      <w:start w:val="1"/>
+      <w:numFmt w:val="lowerRoman"/>
+      <w:lvlText w:val="%3."/>
+      <w:lvlJc w:val="right"/>
+      <w:pPr>
+        <w:ind w:left="2160" w:hanging="180"/>
+      </w:pPr>
+    </w:lvl>
+    <w:lvl w:ilvl="3" w:tplc="1C09000F" w:tentative="1">
+      <w:start w:val="1"/>
+      <w:numFmt w:val="decimal"/>
+      <w:lvlText w:val="%4."/>
+      <w:lvlJc w:val="left"/>
+      <w:pPr>
+        <w:ind w:left="2880" w:hanging="360"/>
+      </w:pPr>
+    </w:lvl>
+    <w:lvl w:ilvl="4" w:tplc="1C090019" w:tentative="1">
+      <w:start w:val="1"/>
+      <w:numFmt w:val="lowerLetter"/>
+      <w:lvlText w:val="%5."/>
+      <w:lvlJc w:val="left"/>
+      <w:pPr>
+        <w:ind w:left="3600" w:hanging="360"/>
+      </w:pPr>
+    </w:lvl>
+    <w:lvl w:ilvl="5" w:tplc="1C09001B" w:tentative="1">
+      <w:start w:val="1"/>
+      <w:numFmt w:val="lowerRoman"/>
+      <w:lvlText w:val="%6."/>
+      <w:lvlJc w:val="right"/>
+      <w:pPr>
+        <w:ind w:left="4320" w:hanging="180"/>
+      </w:pPr>
+    </w:lvl>
+    <w:lvl w:ilvl="6" w:tplc="1C09000F" w:tentative="1">
+      <w:start w:val="1"/>
+      <w:numFmt w:val="decimal"/>
+      <w:lvlText w:val="%7."/>
+      <w:lvlJc w:val="left"/>
+      <w:pPr>
+        <w:ind w:left="5040" w:hanging="360"/>
+      </w:pPr>
+    </w:lvl>
+    <w:lvl w:ilvl="7" w:tplc="1C090019" w:tentative="1">
+      <w:start w:val="1"/>
+      <w:numFmt w:val="lowerLetter"/>
+      <w:lvlText w:val="%8."/>
+      <w:lvlJc w:val="left"/>
+      <w:pPr>
+        <w:ind w:left="5760" w:hanging="360"/>
+      </w:pPr>
+    </w:lvl>
+    <w:lvl w:ilvl="8" w:tplc="1C09001B" w:tentative="1">
+      <w:start w:val="1"/>
+      <w:numFmt w:val="lowerRoman"/>
+      <w:lvlText w:val="%9."/>
+      <w:lvlJc w:val="right"/>
+      <w:pPr>
+        <w:ind w:left="6480" w:hanging="180"/>
+      </w:pPr>
+    </w:lvl>
+  </w:abstractNum>
+  <w:abstractNum w:abstractNumId="22" w15:restartNumberingAfterBreak="0">
     <w:nsid w:val="3FEE3DBE"/>
     <w:multiLevelType w:val="hybridMultilevel"/>
     <w:tmpl w:val="A8AA1A32"/>
@@ -8631,7 +10040,7 @@
       </w:rPr>
     </w:lvl>
   </w:abstractNum>
-  <w:abstractNum w:abstractNumId="21" w15:restartNumberingAfterBreak="0">
+  <w:abstractNum w:abstractNumId="23" w15:restartNumberingAfterBreak="0">
     <w:nsid w:val="40DA321C"/>
     <w:multiLevelType w:val="multilevel"/>
     <w:tmpl w:val="563217B8"/>
@@ -8753,7 +10162,7 @@
       </w:rPr>
     </w:lvl>
   </w:abstractNum>
-  <w:abstractNum w:abstractNumId="22" w15:restartNumberingAfterBreak="0">
+  <w:abstractNum w:abstractNumId="24" w15:restartNumberingAfterBreak="0">
     <w:nsid w:val="4163350C"/>
     <w:multiLevelType w:val="hybridMultilevel"/>
     <w:tmpl w:val="348E96C8"/>
@@ -8842,7 +10251,7 @@
       </w:pPr>
     </w:lvl>
   </w:abstractNum>
-  <w:abstractNum w:abstractNumId="23" w15:restartNumberingAfterBreak="0">
+  <w:abstractNum w:abstractNumId="25" w15:restartNumberingAfterBreak="0">
     <w:nsid w:val="47C2290A"/>
     <w:multiLevelType w:val="hybridMultilevel"/>
     <w:tmpl w:val="19423A2C"/>
@@ -8982,7 +10391,7 @@
       </w:rPr>
     </w:lvl>
   </w:abstractNum>
-  <w:abstractNum w:abstractNumId="24" w15:restartNumberingAfterBreak="0">
+  <w:abstractNum w:abstractNumId="26" w15:restartNumberingAfterBreak="0">
     <w:nsid w:val="66F22390"/>
     <w:multiLevelType w:val="hybridMultilevel"/>
     <w:tmpl w:val="DBB65500"/>
@@ -9071,7 +10480,7 @@
       </w:pPr>
     </w:lvl>
   </w:abstractNum>
-  <w:abstractNum w:abstractNumId="25" w15:restartNumberingAfterBreak="0">
+  <w:abstractNum w:abstractNumId="27" w15:restartNumberingAfterBreak="0">
     <w:nsid w:val="6C49784C"/>
     <w:multiLevelType w:val="hybridMultilevel"/>
     <w:tmpl w:val="AD82E0F0"/>
@@ -9186,7 +10595,7 @@
       </w:rPr>
     </w:lvl>
   </w:abstractNum>
-  <w:abstractNum w:abstractNumId="26" w15:restartNumberingAfterBreak="0">
+  <w:abstractNum w:abstractNumId="28" w15:restartNumberingAfterBreak="0">
     <w:nsid w:val="73E1610C"/>
     <w:multiLevelType w:val="hybridMultilevel"/>
     <w:tmpl w:val="BE043EAA"/>
@@ -9326,7 +10735,7 @@
       </w:rPr>
     </w:lvl>
   </w:abstractNum>
-  <w:abstractNum w:abstractNumId="27" w15:restartNumberingAfterBreak="0">
+  <w:abstractNum w:abstractNumId="29" w15:restartNumberingAfterBreak="0">
     <w:nsid w:val="75701F8F"/>
     <w:multiLevelType w:val="multilevel"/>
     <w:tmpl w:val="830CCA7E"/>
@@ -9440,7 +10849,7 @@
       </w:rPr>
     </w:lvl>
   </w:abstractNum>
-  <w:abstractNum w:abstractNumId="28" w15:restartNumberingAfterBreak="0">
+  <w:abstractNum w:abstractNumId="30" w15:restartNumberingAfterBreak="0">
     <w:nsid w:val="7EC0729D"/>
     <w:multiLevelType w:val="hybridMultilevel"/>
     <w:tmpl w:val="7568AE90"/>
@@ -9683,28 +11092,28 @@
     <w:abstractNumId w:val="13"/>
   </w:num>
   <w:num w:numId="19" w16cid:durableId="538009621">
-    <w:abstractNumId w:val="19"/>
+    <w:abstractNumId w:val="20"/>
   </w:num>
   <w:num w:numId="20" w16cid:durableId="1065957968">
-    <w:abstractNumId w:val="23"/>
+    <w:abstractNumId w:val="25"/>
   </w:num>
   <w:num w:numId="21" w16cid:durableId="951597315">
-    <w:abstractNumId w:val="26"/>
+    <w:abstractNumId w:val="28"/>
   </w:num>
   <w:num w:numId="22" w16cid:durableId="191766566">
-    <w:abstractNumId w:val="28"/>
+    <w:abstractNumId w:val="30"/>
   </w:num>
   <w:num w:numId="23" w16cid:durableId="530924727">
     <w:abstractNumId w:val="16"/>
   </w:num>
   <w:num w:numId="24" w16cid:durableId="1515193794">
-    <w:abstractNumId w:val="20"/>
+    <w:abstractNumId w:val="22"/>
   </w:num>
   <w:num w:numId="25" w16cid:durableId="1784416669">
-    <w:abstractNumId w:val="21"/>
+    <w:abstractNumId w:val="23"/>
   </w:num>
   <w:num w:numId="26" w16cid:durableId="168521085">
-    <w:abstractNumId w:val="21"/>
+    <w:abstractNumId w:val="23"/>
     <w:lvlOverride w:ilvl="0">
       <w:startOverride w:val="1"/>
     </w:lvlOverride>
@@ -9737,10 +11146,10 @@
     <w:abstractNumId w:val="11"/>
   </w:num>
   <w:num w:numId="28" w16cid:durableId="2086760853">
-    <w:abstractNumId w:val="21"/>
+    <w:abstractNumId w:val="23"/>
   </w:num>
   <w:num w:numId="29" w16cid:durableId="170687412">
-    <w:abstractNumId w:val="21"/>
+    <w:abstractNumId w:val="23"/>
     <w:lvlOverride w:ilvl="0">
       <w:startOverride w:val="1"/>
     </w:lvlOverride>
@@ -9770,25 +11179,25 @@
     </w:lvlOverride>
   </w:num>
   <w:num w:numId="30" w16cid:durableId="646058130">
-    <w:abstractNumId w:val="21"/>
+    <w:abstractNumId w:val="23"/>
   </w:num>
   <w:num w:numId="31" w16cid:durableId="976489337">
-    <w:abstractNumId w:val="21"/>
+    <w:abstractNumId w:val="23"/>
   </w:num>
   <w:num w:numId="32" w16cid:durableId="517932747">
-    <w:abstractNumId w:val="25"/>
+    <w:abstractNumId w:val="27"/>
   </w:num>
   <w:num w:numId="33" w16cid:durableId="501705626">
-    <w:abstractNumId w:val="22"/>
+    <w:abstractNumId w:val="24"/>
   </w:num>
   <w:num w:numId="34" w16cid:durableId="2083748915">
     <w:abstractNumId w:val="15"/>
   </w:num>
   <w:num w:numId="35" w16cid:durableId="1795753433">
-    <w:abstractNumId w:val="27"/>
+    <w:abstractNumId w:val="29"/>
   </w:num>
   <w:num w:numId="36" w16cid:durableId="859659272">
-    <w:abstractNumId w:val="21"/>
+    <w:abstractNumId w:val="23"/>
     <w:lvlOverride w:ilvl="0">
       <w:lvl w:ilvl="0">
         <w:start w:val="1"/>
@@ -9929,7 +11338,13 @@
     <w:abstractNumId w:val="18"/>
   </w:num>
   <w:num w:numId="38" w16cid:durableId="921985433">
-    <w:abstractNumId w:val="24"/>
+    <w:abstractNumId w:val="26"/>
+  </w:num>
+  <w:num w:numId="39" w16cid:durableId="1689062468">
+    <w:abstractNumId w:val="21"/>
+  </w:num>
+  <w:num w:numId="40" w16cid:durableId="1793590475">
+    <w:abstractNumId w:val="19"/>
   </w:num>
 </w:numbering>
 </file>
@@ -10524,6 +11939,7 @@
   <w:style w:type="character" w:default="1" w:styleId="DefaultParagraphFont">
     <w:name w:val="Default Paragraph Font"/>
     <w:uiPriority w:val="1"/>
+    <w:semiHidden/>
     <w:unhideWhenUsed/>
   </w:style>
   <w:style w:type="table" w:default="1" w:styleId="TableNormal">
@@ -11697,28 +13113,6 @@
 </file>
 
 <file path=customXml/item1.xml><?xml version="1.0" encoding="utf-8"?>
-<b:Sources xmlns:b="http://schemas.openxmlformats.org/officeDocument/2006/bibliography" xmlns="http://schemas.openxmlformats.org/officeDocument/2006/bibliography" SelectedStyle="\APA.XSL" StyleName="APA"/>
-</file>
-
-<file path=customXml/item2.xml><?xml version="1.0" encoding="utf-8"?>
-<p:properties xmlns:p="http://schemas.microsoft.com/office/2006/metadata/properties" xmlns:xsi="http://www.w3.org/2001/XMLSchema-instance" xmlns:pc="http://schemas.microsoft.com/office/infopath/2007/PartnerControls">
-  <documentManagement>
-    <PublishingExpirationDate xmlns="http://schemas.microsoft.com/sharepoint/v3" xsi:nil="true"/>
-    <PublishingStartDate xmlns="http://schemas.microsoft.com/sharepoint/v3" xsi:nil="true"/>
-  </documentManagement>
-</p:properties>
-</file>
-
-<file path=customXml/item3.xml><?xml version="1.0" encoding="utf-8"?>
-<?mso-contentType ?>
-<FormTemplates xmlns="http://schemas.microsoft.com/sharepoint/v3/contenttype/forms">
-  <Display>DocumentLibraryForm</Display>
-  <Edit>DocumentLibraryForm</Edit>
-  <New>DocumentLibraryForm</New>
-</FormTemplates>
-</file>
-
-<file path=customXml/item4.xml><?xml version="1.0" encoding="utf-8"?>
 <ct:contentTypeSchema xmlns:ct="http://schemas.microsoft.com/office/2006/metadata/contentType" xmlns:ma="http://schemas.microsoft.com/office/2006/metadata/properties/metaAttributes" ct:_="" ma:_="" ma:contentTypeName="Document" ma:contentTypeID="0x0101001B24F5B3BD440644B6F7AF970BDAC99D" ma:contentTypeVersion="2" ma:contentTypeDescription="Create a new document." ma:contentTypeScope="" ma:versionID="0268b0d044a22ef0ccf832b8cf72a65a">
   <xsd:schema xmlns:xsd="http://www.w3.org/2001/XMLSchema" xmlns:xs="http://www.w3.org/2001/XMLSchema" xmlns:p="http://schemas.microsoft.com/office/2006/metadata/properties" xmlns:ns1="http://schemas.microsoft.com/sharepoint/v3" xmlns:ns2="3d0ffbf4-0ab1-4e4b-bd8c-865f61d41201" targetNamespace="http://schemas.microsoft.com/office/2006/metadata/properties" ma:root="true" ma:fieldsID="0358fc54e04717fd1f8ea0dccb55e9fc" ns1:_="" ns2:_="">
     <xsd:import namespace="http://schemas.microsoft.com/sharepoint/v3"/>
@@ -11875,33 +13269,29 @@
 </ct:contentTypeSchema>
 </file>
 
-<file path=customXml/itemProps1.xml><?xml version="1.0" encoding="utf-8"?>
-<ds:datastoreItem xmlns:ds="http://schemas.openxmlformats.org/officeDocument/2006/customXml" ds:itemID="{01ACFA79-ECAD-4571-84B3-B405206904C6}">
-  <ds:schemaRefs>
-    <ds:schemaRef ds:uri="http://schemas.openxmlformats.org/officeDocument/2006/bibliography"/>
-  </ds:schemaRefs>
-</ds:datastoreItem>
+<file path=customXml/item2.xml><?xml version="1.0" encoding="utf-8"?>
+<?mso-contentType ?>
+<FormTemplates xmlns="http://schemas.microsoft.com/sharepoint/v3/contenttype/forms">
+  <Display>DocumentLibraryForm</Display>
+  <Edit>DocumentLibraryForm</Edit>
+  <New>DocumentLibraryForm</New>
+</FormTemplates>
 </file>
 
-<file path=customXml/itemProps2.xml><?xml version="1.0" encoding="utf-8"?>
-<ds:datastoreItem xmlns:ds="http://schemas.openxmlformats.org/officeDocument/2006/customXml" ds:itemID="{936D9E23-3EFE-4815-8E28-B89747E3B44A}">
-  <ds:schemaRefs>
-    <ds:schemaRef ds:uri="http://schemas.microsoft.com/office/2006/metadata/properties"/>
-    <ds:schemaRef ds:uri="http://schemas.microsoft.com/office/infopath/2007/PartnerControls"/>
-    <ds:schemaRef ds:uri="http://schemas.microsoft.com/sharepoint/v3"/>
-  </ds:schemaRefs>
-</ds:datastoreItem>
+<file path=customXml/item3.xml><?xml version="1.0" encoding="utf-8"?>
+<p:properties xmlns:p="http://schemas.microsoft.com/office/2006/metadata/properties" xmlns:xsi="http://www.w3.org/2001/XMLSchema-instance" xmlns:pc="http://schemas.microsoft.com/office/infopath/2007/PartnerControls">
+  <documentManagement>
+    <PublishingExpirationDate xmlns="http://schemas.microsoft.com/sharepoint/v3" xsi:nil="true"/>
+    <PublishingStartDate xmlns="http://schemas.microsoft.com/sharepoint/v3" xsi:nil="true"/>
+  </documentManagement>
+</p:properties>
 </file>
 
-<file path=customXml/itemProps3.xml><?xml version="1.0" encoding="utf-8"?>
-<ds:datastoreItem xmlns:ds="http://schemas.openxmlformats.org/officeDocument/2006/customXml" ds:itemID="{A79ABC99-42DE-498E-A8A6-769FA2FAB453}">
-  <ds:schemaRefs>
-    <ds:schemaRef ds:uri="http://schemas.microsoft.com/sharepoint/v3/contenttype/forms"/>
-  </ds:schemaRefs>
-</ds:datastoreItem>
+<file path=customXml/item4.xml><?xml version="1.0" encoding="utf-8"?>
+<b:Sources xmlns:b="http://schemas.openxmlformats.org/officeDocument/2006/bibliography" xmlns="http://schemas.openxmlformats.org/officeDocument/2006/bibliography" SelectedStyle="\APA.XSL" StyleName="APA"/>
 </file>
 
-<file path=customXml/itemProps4.xml><?xml version="1.0" encoding="utf-8"?>
+<file path=customXml/itemProps1.xml><?xml version="1.0" encoding="utf-8"?>
 <ds:datastoreItem xmlns:ds="http://schemas.openxmlformats.org/officeDocument/2006/customXml" ds:itemID="{42379727-DB28-43E8-83F1-7EC68C26AC22}">
   <ds:schemaRefs>
     <ds:schemaRef ds:uri="http://schemas.microsoft.com/office/2006/metadata/contentType"/>
@@ -11918,4 +13308,30 @@
     <ds:schemaRef ds:uri="http://schemas.microsoft.com/internal/obd"/>
   </ds:schemaRefs>
 </ds:datastoreItem>
+</file>
+
+<file path=customXml/itemProps2.xml><?xml version="1.0" encoding="utf-8"?>
+<ds:datastoreItem xmlns:ds="http://schemas.openxmlformats.org/officeDocument/2006/customXml" ds:itemID="{A79ABC99-42DE-498E-A8A6-769FA2FAB453}">
+  <ds:schemaRefs>
+    <ds:schemaRef ds:uri="http://schemas.microsoft.com/sharepoint/v3/contenttype/forms"/>
+  </ds:schemaRefs>
+</ds:datastoreItem>
+</file>
+
+<file path=customXml/itemProps3.xml><?xml version="1.0" encoding="utf-8"?>
+<ds:datastoreItem xmlns:ds="http://schemas.openxmlformats.org/officeDocument/2006/customXml" ds:itemID="{936D9E23-3EFE-4815-8E28-B89747E3B44A}">
+  <ds:schemaRefs>
+    <ds:schemaRef ds:uri="http://schemas.microsoft.com/office/2006/metadata/properties"/>
+    <ds:schemaRef ds:uri="http://schemas.microsoft.com/office/infopath/2007/PartnerControls"/>
+    <ds:schemaRef ds:uri="http://schemas.microsoft.com/sharepoint/v3"/>
+  </ds:schemaRefs>
+</ds:datastoreItem>
+</file>
+
+<file path=customXml/itemProps4.xml><?xml version="1.0" encoding="utf-8"?>
+<ds:datastoreItem xmlns:ds="http://schemas.openxmlformats.org/officeDocument/2006/customXml" ds:itemID="{01ACFA79-ECAD-4571-84B3-B405206904C6}">
+  <ds:schemaRefs>
+    <ds:schemaRef ds:uri="http://schemas.openxmlformats.org/officeDocument/2006/bibliography"/>
+  </ds:schemaRefs>
+</ds:datastoreItem>
 </file>
</xml_diff>